<commit_message>
chore(customization): update skills and configurations
</commit_message>
<xml_diff>
--- a/customization/skills/ticket.answer-ticket/template.docx
+++ b/customization/skills/ticket.answer-ticket/template.docx
@@ -40,7 +40,7 @@
                   <pic:blipFill>
                     <a:blip r:embed="rId7" cstate="print">
                       <a:extLst>
-                        <a:ext uri="{28A0092B-C50C-407E-A947-70E740481C1C}">
+                        <a:ext uri="{{28A0092B-C50C-407E-A947-70E740481C1C}}">
                           <a14:useLocalDpi xmlns:a14="http://schemas.microsoft.com/office/drawing/2010/main" val="0"/>
                         </a:ext>
                       </a:extLst>
@@ -318,7 +318,7 @@
           <w:sz w:val="22"/>
           <w:szCs w:val="22"/>
         </w:rPr>
-        <w:t>{</w:t>
+        <w:t>{{</w:t>
       </w:r>
       <w:proofErr w:type="spellStart"/>
       <w:r>
@@ -334,7 +334,7 @@
           <w:sz w:val="22"/>
           <w:szCs w:val="22"/>
         </w:rPr>
-        <w:t>}</w:t>
+        <w:t>}}</w:t>
       </w:r>
     </w:p>
     <w:p>
@@ -369,7 +369,7 @@
           <w:sz w:val="22"/>
           <w:szCs w:val="22"/>
         </w:rPr>
-        <w:t>{</w:t>
+        <w:t>{{</w:t>
       </w:r>
       <w:proofErr w:type="gramStart"/>
       <w:r>
@@ -385,7 +385,7 @@
           <w:sz w:val="22"/>
           <w:szCs w:val="22"/>
         </w:rPr>
-        <w:t>}</w:t>
+        <w:t>}}</w:t>
       </w:r>
     </w:p>
     <w:p>

</xml_diff>